<commit_message>
SISTEMA DE GESTÃO DE BIBLIOTECAS: 98% CONCLUÍDO
</commit_message>
<xml_diff>
--- a/SIGEBIBLIOTECA/SIGEBIBLIOTECA/documentacao/Guia de Desenvolvimento - Anifa Armando.docx
+++ b/SIGEBIBLIOTECA/SIGEBIBLIOTECA/documentacao/Guia de Desenvolvimento - Anifa Armando.docx
@@ -2498,6 +2498,356 @@
       </w:r>
       <w:r>
         <w:t xml:space="preserve"> Validar se no 5º e 10º empréstimo do leitor o desconto de 10% é aplicado corretamente.</w:t>
+      </w:r>
+    </w:p>
+    <w:p>
+      <w:pPr>
+        <w:rPr>
+          <w:b/>
+          <w:bCs/>
+        </w:rPr>
+      </w:pPr>
+      <w:r>
+        <w:rPr>
+          <w:b/>
+          <w:bCs/>
+        </w:rPr>
+        <w:t>FASE 8: Implementação do Módulo de Relatórios Gerenciais e Exportação</w:t>
+      </w:r>
+    </w:p>
+    <w:p>
+      <w:r>
+        <w:rPr>
+          <w:b/>
+          <w:bCs/>
+        </w:rPr>
+        <w:t>Objetivo:</w:t>
+      </w:r>
+      <w:r>
+        <w:t xml:space="preserve"> Desenvolver a interface visual e a lógica de backend para a extração de métricas, consolidação de dados financeiros/operacionais e emissão de relatórios sintéticos e analíticos.</w:t>
+      </w:r>
+    </w:p>
+    <w:p>
+      <w:pPr>
+        <w:rPr>
+          <w:b/>
+          <w:bCs/>
+        </w:rPr>
+      </w:pPr>
+      <w:r>
+        <w:rPr>
+          <w:b/>
+          <w:bCs/>
+        </w:rPr>
+        <w:t>Passo 8.1: Construção das Procedures e Queries de Consolidação (Banco de Dados)</w:t>
+      </w:r>
+    </w:p>
+    <w:p>
+      <w:pPr>
+        <w:numPr>
+          <w:ilvl w:val="0"/>
+          <w:numId w:val="17"/>
+        </w:numPr>
+      </w:pPr>
+      <w:r>
+        <w:rPr>
+          <w:b/>
+          <w:bCs/>
+        </w:rPr>
+        <w:t>Ação:</w:t>
+      </w:r>
+      <w:r>
+        <w:t xml:space="preserve"> Criar no MySQL as </w:t>
+      </w:r>
+      <w:r>
+        <w:rPr>
+          <w:i/>
+          <w:iCs/>
+        </w:rPr>
+        <w:t>views</w:t>
+      </w:r>
+      <w:r>
+        <w:t xml:space="preserve"> e </w:t>
+      </w:r>
+      <w:r>
+        <w:rPr>
+          <w:i/>
+          <w:iCs/>
+        </w:rPr>
+        <w:t>stored procedures</w:t>
+      </w:r>
+      <w:r>
+        <w:t xml:space="preserve"> responsáveis por agregar informações do acervo, leitores, empréstimos e movimentações financeiras.</w:t>
+      </w:r>
+    </w:p>
+    <w:p>
+      <w:pPr>
+        <w:numPr>
+          <w:ilvl w:val="0"/>
+          <w:numId w:val="17"/>
+        </w:numPr>
+      </w:pPr>
+      <w:r>
+        <w:rPr>
+          <w:b/>
+          <w:bCs/>
+        </w:rPr>
+        <w:t>Detalhamento:</w:t>
+      </w:r>
+    </w:p>
+    <w:p>
+      <w:pPr>
+        <w:numPr>
+          <w:ilvl w:val="1"/>
+          <w:numId w:val="17"/>
+        </w:numPr>
+      </w:pPr>
+      <w:r>
+        <w:t>sp_RelatorioFinanceiro: Retorna faturamento por período agrupando adiantamentos (70%), saldos finais (30%), multas por atraso e multas por dano.</w:t>
+      </w:r>
+    </w:p>
+    <w:p>
+      <w:pPr>
+        <w:numPr>
+          <w:ilvl w:val="1"/>
+          <w:numId w:val="17"/>
+        </w:numPr>
+      </w:pPr>
+      <w:r>
+        <w:t>sp_RelatorioEmprestimosStatus: Filtra empréstimos por intervalo de datas e estado (em_andamento, devolvido, atrasado).</w:t>
+      </w:r>
+    </w:p>
+    <w:p>
+      <w:pPr>
+        <w:numPr>
+          <w:ilvl w:val="1"/>
+          <w:numId w:val="17"/>
+        </w:numPr>
+      </w:pPr>
+      <w:r>
+        <w:t>sp_RelatorioMaisLidos: Ranking dos livros com maior número de retiradas.</w:t>
+      </w:r>
+    </w:p>
+    <w:p>
+      <w:pPr>
+        <w:rPr>
+          <w:b/>
+          <w:bCs/>
+        </w:rPr>
+      </w:pPr>
+      <w:r>
+        <w:rPr>
+          <w:b/>
+          <w:bCs/>
+        </w:rPr>
+        <w:lastRenderedPageBreak/>
+        <w:t>Passo 8.2: Criação do Web Form (Relatorios.aspx)</w:t>
+      </w:r>
+    </w:p>
+    <w:p>
+      <w:pPr>
+        <w:numPr>
+          <w:ilvl w:val="0"/>
+          <w:numId w:val="18"/>
+        </w:numPr>
+      </w:pPr>
+      <w:r>
+        <w:rPr>
+          <w:b/>
+          <w:bCs/>
+        </w:rPr>
+        <w:t>Ação:</w:t>
+      </w:r>
+      <w:r>
+        <w:t xml:space="preserve"> Construir a interface responsiva da página de relatórios utilizando Bootstrap e FontAwesome.</w:t>
+      </w:r>
+    </w:p>
+    <w:p>
+      <w:pPr>
+        <w:numPr>
+          <w:ilvl w:val="0"/>
+          <w:numId w:val="18"/>
+        </w:numPr>
+      </w:pPr>
+      <w:r>
+        <w:rPr>
+          <w:b/>
+          <w:bCs/>
+        </w:rPr>
+        <w:t>Detalhamento:</w:t>
+      </w:r>
+    </w:p>
+    <w:p>
+      <w:pPr>
+        <w:numPr>
+          <w:ilvl w:val="1"/>
+          <w:numId w:val="18"/>
+        </w:numPr>
+      </w:pPr>
+      <w:r>
+        <w:t>Incluir filtros de busca na parte superior (intervalos de txtDataInicio e txtDataFim, DropDownList de ddlTipoRelatorio e ddlStatus).</w:t>
+      </w:r>
+    </w:p>
+    <w:p>
+      <w:pPr>
+        <w:numPr>
+          <w:ilvl w:val="1"/>
+          <w:numId w:val="18"/>
+        </w:numPr>
+      </w:pPr>
+      <w:r>
+        <w:t>Adicionar cards de resumo executivo (KPIs com total arrecadado, total de empréstimos no período e taxa de devolução no prazo).</w:t>
+      </w:r>
+    </w:p>
+    <w:p>
+      <w:pPr>
+        <w:numPr>
+          <w:ilvl w:val="1"/>
+          <w:numId w:val="18"/>
+        </w:numPr>
+      </w:pPr>
+      <w:r>
+        <w:t>Configurar um GridView dinâmico para exibição dos dados filtrados com formatação monetária (MT) e temporal (dd/MM/yyyy).</w:t>
+      </w:r>
+    </w:p>
+    <w:p>
+      <w:pPr>
+        <w:rPr>
+          <w:b/>
+          <w:bCs/>
+        </w:rPr>
+      </w:pPr>
+      <w:r>
+        <w:rPr>
+          <w:b/>
+          <w:bCs/>
+        </w:rPr>
+        <w:t>Passo 8.3: Implementação do Code-Behind (Relatorios.aspx.vb)</w:t>
+      </w:r>
+    </w:p>
+    <w:p>
+      <w:pPr>
+        <w:numPr>
+          <w:ilvl w:val="0"/>
+          <w:numId w:val="19"/>
+        </w:numPr>
+      </w:pPr>
+      <w:r>
+        <w:rPr>
+          <w:b/>
+          <w:bCs/>
+        </w:rPr>
+        <w:t>Ação:</w:t>
+      </w:r>
+      <w:r>
+        <w:t xml:space="preserve"> Escrever a lógica em VB.NET para interagir com a camada de dados (DAL) e alimentar a interface conforme os filtros selecionados.</w:t>
+      </w:r>
+    </w:p>
+    <w:p>
+      <w:pPr>
+        <w:numPr>
+          <w:ilvl w:val="0"/>
+          <w:numId w:val="19"/>
+        </w:numPr>
+      </w:pPr>
+      <w:r>
+        <w:rPr>
+          <w:b/>
+          <w:bCs/>
+        </w:rPr>
+        <w:t>Detalhamento:</w:t>
+      </w:r>
+    </w:p>
+    <w:p>
+      <w:pPr>
+        <w:numPr>
+          <w:ilvl w:val="1"/>
+          <w:numId w:val="19"/>
+        </w:numPr>
+      </w:pPr>
+      <w:r>
+        <w:t>Criar o método CarregarRelatorio() acionado pelos botões de filtragem (btnFiltrar_Click) e limpa-filtros (btnLimpar_Click).</w:t>
+      </w:r>
+    </w:p>
+    <w:p>
+      <w:pPr>
+        <w:numPr>
+          <w:ilvl w:val="1"/>
+          <w:numId w:val="19"/>
+        </w:numPr>
+      </w:pPr>
+      <w:r>
+        <w:t>Tratar exceções de conversão de datas e dados nulos (DBNull).</w:t>
+      </w:r>
+    </w:p>
+    <w:p>
+      <w:pPr>
+        <w:numPr>
+          <w:ilvl w:val="1"/>
+          <w:numId w:val="19"/>
+        </w:numPr>
+      </w:pPr>
+      <w:r>
+        <w:t>Calcular o somatório dos totais na rodapé do GridView (FooterRow) ou nos cards de resumo executivo.</w:t>
+      </w:r>
+    </w:p>
+    <w:p>
+      <w:pPr>
+        <w:rPr>
+          <w:b/>
+          <w:bCs/>
+        </w:rPr>
+      </w:pPr>
+      <w:r>
+        <w:rPr>
+          <w:b/>
+          <w:bCs/>
+        </w:rPr>
+        <w:t>Passo 8.4: Estilização para Impressão e Exportação</w:t>
+      </w:r>
+    </w:p>
+    <w:p>
+      <w:pPr>
+        <w:numPr>
+          <w:ilvl w:val="0"/>
+          <w:numId w:val="20"/>
+        </w:numPr>
+      </w:pPr>
+      <w:r>
+        <w:rPr>
+          <w:b/>
+          <w:bCs/>
+        </w:rPr>
+        <w:t>Ação:</w:t>
+      </w:r>
+      <w:r>
+        <w:t xml:space="preserve"> Implementar estilos CSS de impressão (@media print) para ocultar o menu lateral (MenuLateral.ascx), botões de ação e filtros durante a emissão física ou salvamento em PDF.</w:t>
+      </w:r>
+    </w:p>
+    <w:p>
+      <w:pPr>
+        <w:numPr>
+          <w:ilvl w:val="0"/>
+          <w:numId w:val="20"/>
+        </w:numPr>
+      </w:pPr>
+      <w:r>
+        <w:rPr>
+          <w:b/>
+          <w:bCs/>
+        </w:rPr>
+        <w:t>Detalhamento:</w:t>
+      </w:r>
+    </w:p>
+    <w:p>
+      <w:pPr>
+        <w:numPr>
+          <w:ilvl w:val="1"/>
+          <w:numId w:val="20"/>
+        </w:numPr>
+      </w:pPr>
+      <w:r>
+        <w:t>Garantir que apenas o cabeçalho do relatório e a tabela de dados sejam visíveis na visualização de impressão do navegador.</w:t>
       </w:r>
     </w:p>
     <w:p/>
@@ -2514,6 +2864,155 @@
 <file path=word/numbering.xml><?xml version="1.0" encoding="utf-8"?>
 <w:numbering xmlns:wpc="http://schemas.microsoft.com/office/word/2010/wordprocessingCanvas" xmlns:cx="http://schemas.microsoft.com/office/drawing/2014/chartex" xmlns:cx1="http://schemas.microsoft.com/office/drawing/2015/9/8/chartex" xmlns:cx2="http://schemas.microsoft.com/office/drawing/2015/10/21/chartex" xmlns:cx3="http://schemas.microsoft.com/office/drawing/2016/5/9/chartex" xmlns:cx4="http://schemas.microsoft.com/office/drawing/2016/5/10/chartex" xmlns:cx5="http://schemas.microsoft.com/office/drawing/2016/5/11/chartex" xmlns:cx6="http://schemas.microsoft.com/office/drawing/2016/5/12/chartex" xmlns:cx7="http://schemas.microsoft.com/office/drawing/2016/5/13/chartex" xmlns:cx8="http://schemas.microsoft.com/office/drawing/2016/5/14/chartex" xmlns:mc="http://schemas.openxmlformats.org/markup-compatibility/2006" xmlns:aink="http://schemas.microsoft.com/office/drawing/2016/ink" xmlns:am3d="http://schemas.microsoft.com/office/drawing/2017/model3d" xmlns:o="urn:schemas-microsoft-com:office:office" xmlns:oel="http://schemas.microsoft.com/office/2019/extlst" xmlns:r="http://schemas.openxmlformats.org/officeDocument/2006/relationships" xmlns:m="http://schemas.openxmlformats.org/officeDocument/2006/math" xmlns:v="urn:schemas-microsoft-com:vml" xmlns:wp14="http://schemas.microsoft.com/office/word/2010/wordprocessingDrawing" xmlns:wp="http://schemas.openxmlformats.org/drawingml/2006/wordprocessingDrawing" xmlns:w10="urn:schemas-microsoft-com:office:word" xmlns:w="http://schemas.openxmlformats.org/wordprocessingml/2006/main" xmlns:w14="http://schemas.microsoft.com/office/word/2010/wordml" xmlns:w15="http://schemas.microsoft.com/office/word/2012/wordml" xmlns:w16cex="http://schemas.microsoft.com/office/word/2018/wordml/cex" xmlns:w16cid="http://schemas.microsoft.com/office/word/2016/wordml/cid" xmlns:w16="http://schemas.microsoft.com/office/word/2018/wordml" xmlns:w16sdtdh="http://schemas.microsoft.com/office/word/2020/wordml/sdtdatahash" xmlns:w16se="http://schemas.microsoft.com/office/word/2015/wordml/symex" xmlns:wpg="http://schemas.microsoft.com/office/word/2010/wordprocessingGroup" xmlns:wpi="http://schemas.microsoft.com/office/word/2010/wordprocessingInk" xmlns:wne="http://schemas.microsoft.com/office/word/2006/wordml" xmlns:wps="http://schemas.microsoft.com/office/word/2010/wordprocessingShape" mc:Ignorable="w14 w15 w16se w16cid w16 w16cex w16sdtdh wp14">
   <w:abstractNum w:abstractNumId="0" w15:restartNumberingAfterBreak="0">
+    <w:nsid w:val="029652C1"/>
+    <w:multiLevelType w:val="multilevel"/>
+    <w:tmpl w:val="E944586E"/>
+    <w:lvl w:ilvl="0">
+      <w:start w:val="1"/>
+      <w:numFmt w:val="bullet"/>
+      <w:lvlText w:val=""/>
+      <w:lvlJc w:val="left"/>
+      <w:pPr>
+        <w:tabs>
+          <w:tab w:val="num" w:pos="720"/>
+        </w:tabs>
+        <w:ind w:left="720" w:hanging="360"/>
+      </w:pPr>
+      <w:rPr>
+        <w:rFonts w:ascii="Symbol" w:hAnsi="Symbol" w:hint="default"/>
+        <w:sz w:val="20"/>
+      </w:rPr>
+    </w:lvl>
+    <w:lvl w:ilvl="1">
+      <w:start w:val="1"/>
+      <w:numFmt w:val="bullet"/>
+      <w:lvlText w:val="o"/>
+      <w:lvlJc w:val="left"/>
+      <w:pPr>
+        <w:tabs>
+          <w:tab w:val="num" w:pos="1440"/>
+        </w:tabs>
+        <w:ind w:left="1440" w:hanging="360"/>
+      </w:pPr>
+      <w:rPr>
+        <w:rFonts w:ascii="Courier New" w:hAnsi="Courier New" w:hint="default"/>
+        <w:sz w:val="20"/>
+      </w:rPr>
+    </w:lvl>
+    <w:lvl w:ilvl="2" w:tentative="1">
+      <w:start w:val="1"/>
+      <w:numFmt w:val="bullet"/>
+      <w:lvlText w:val=""/>
+      <w:lvlJc w:val="left"/>
+      <w:pPr>
+        <w:tabs>
+          <w:tab w:val="num" w:pos="2160"/>
+        </w:tabs>
+        <w:ind w:left="2160" w:hanging="360"/>
+      </w:pPr>
+      <w:rPr>
+        <w:rFonts w:ascii="Wingdings" w:hAnsi="Wingdings" w:hint="default"/>
+        <w:sz w:val="20"/>
+      </w:rPr>
+    </w:lvl>
+    <w:lvl w:ilvl="3" w:tentative="1">
+      <w:start w:val="1"/>
+      <w:numFmt w:val="bullet"/>
+      <w:lvlText w:val=""/>
+      <w:lvlJc w:val="left"/>
+      <w:pPr>
+        <w:tabs>
+          <w:tab w:val="num" w:pos="2880"/>
+        </w:tabs>
+        <w:ind w:left="2880" w:hanging="360"/>
+      </w:pPr>
+      <w:rPr>
+        <w:rFonts w:ascii="Wingdings" w:hAnsi="Wingdings" w:hint="default"/>
+        <w:sz w:val="20"/>
+      </w:rPr>
+    </w:lvl>
+    <w:lvl w:ilvl="4" w:tentative="1">
+      <w:start w:val="1"/>
+      <w:numFmt w:val="bullet"/>
+      <w:lvlText w:val=""/>
+      <w:lvlJc w:val="left"/>
+      <w:pPr>
+        <w:tabs>
+          <w:tab w:val="num" w:pos="3600"/>
+        </w:tabs>
+        <w:ind w:left="3600" w:hanging="360"/>
+      </w:pPr>
+      <w:rPr>
+        <w:rFonts w:ascii="Wingdings" w:hAnsi="Wingdings" w:hint="default"/>
+        <w:sz w:val="20"/>
+      </w:rPr>
+    </w:lvl>
+    <w:lvl w:ilvl="5" w:tentative="1">
+      <w:start w:val="1"/>
+      <w:numFmt w:val="bullet"/>
+      <w:lvlText w:val=""/>
+      <w:lvlJc w:val="left"/>
+      <w:pPr>
+        <w:tabs>
+          <w:tab w:val="num" w:pos="4320"/>
+        </w:tabs>
+        <w:ind w:left="4320" w:hanging="360"/>
+      </w:pPr>
+      <w:rPr>
+        <w:rFonts w:ascii="Wingdings" w:hAnsi="Wingdings" w:hint="default"/>
+        <w:sz w:val="20"/>
+      </w:rPr>
+    </w:lvl>
+    <w:lvl w:ilvl="6" w:tentative="1">
+      <w:start w:val="1"/>
+      <w:numFmt w:val="bullet"/>
+      <w:lvlText w:val=""/>
+      <w:lvlJc w:val="left"/>
+      <w:pPr>
+        <w:tabs>
+          <w:tab w:val="num" w:pos="5040"/>
+        </w:tabs>
+        <w:ind w:left="5040" w:hanging="360"/>
+      </w:pPr>
+      <w:rPr>
+        <w:rFonts w:ascii="Wingdings" w:hAnsi="Wingdings" w:hint="default"/>
+        <w:sz w:val="20"/>
+      </w:rPr>
+    </w:lvl>
+    <w:lvl w:ilvl="7" w:tentative="1">
+      <w:start w:val="1"/>
+      <w:numFmt w:val="bullet"/>
+      <w:lvlText w:val=""/>
+      <w:lvlJc w:val="left"/>
+      <w:pPr>
+        <w:tabs>
+          <w:tab w:val="num" w:pos="5760"/>
+        </w:tabs>
+        <w:ind w:left="5760" w:hanging="360"/>
+      </w:pPr>
+      <w:rPr>
+        <w:rFonts w:ascii="Wingdings" w:hAnsi="Wingdings" w:hint="default"/>
+        <w:sz w:val="20"/>
+      </w:rPr>
+    </w:lvl>
+    <w:lvl w:ilvl="8" w:tentative="1">
+      <w:start w:val="1"/>
+      <w:numFmt w:val="bullet"/>
+      <w:lvlText w:val=""/>
+      <w:lvlJc w:val="left"/>
+      <w:pPr>
+        <w:tabs>
+          <w:tab w:val="num" w:pos="6480"/>
+        </w:tabs>
+        <w:ind w:left="6480" w:hanging="360"/>
+      </w:pPr>
+      <w:rPr>
+        <w:rFonts w:ascii="Wingdings" w:hAnsi="Wingdings" w:hint="default"/>
+        <w:sz w:val="20"/>
+      </w:rPr>
+    </w:lvl>
+  </w:abstractNum>
+  <w:abstractNum w:abstractNumId="1" w15:restartNumberingAfterBreak="0">
     <w:nsid w:val="044D24A1"/>
     <w:multiLevelType w:val="multilevel"/>
     <w:tmpl w:val="B7D63F6A"/>
@@ -2662,7 +3161,7 @@
       </w:rPr>
     </w:lvl>
   </w:abstractNum>
-  <w:abstractNum w:abstractNumId="1" w15:restartNumberingAfterBreak="0">
+  <w:abstractNum w:abstractNumId="2" w15:restartNumberingAfterBreak="0">
     <w:nsid w:val="049D33F6"/>
     <w:multiLevelType w:val="multilevel"/>
     <w:tmpl w:val="4EA0B888"/>
@@ -2807,7 +3306,7 @@
       </w:rPr>
     </w:lvl>
   </w:abstractNum>
-  <w:abstractNum w:abstractNumId="2" w15:restartNumberingAfterBreak="0">
+  <w:abstractNum w:abstractNumId="3" w15:restartNumberingAfterBreak="0">
     <w:nsid w:val="0B9B5D29"/>
     <w:multiLevelType w:val="multilevel"/>
     <w:tmpl w:val="6510B282"/>
@@ -2952,7 +3451,7 @@
       </w:rPr>
     </w:lvl>
   </w:abstractNum>
-  <w:abstractNum w:abstractNumId="3" w15:restartNumberingAfterBreak="0">
+  <w:abstractNum w:abstractNumId="4" w15:restartNumberingAfterBreak="0">
     <w:nsid w:val="0BE21AC4"/>
     <w:multiLevelType w:val="multilevel"/>
     <w:tmpl w:val="F4AE5B5C"/>
@@ -3097,7 +3596,7 @@
       </w:rPr>
     </w:lvl>
   </w:abstractNum>
-  <w:abstractNum w:abstractNumId="4" w15:restartNumberingAfterBreak="0">
+  <w:abstractNum w:abstractNumId="5" w15:restartNumberingAfterBreak="0">
     <w:nsid w:val="0D08244F"/>
     <w:multiLevelType w:val="multilevel"/>
     <w:tmpl w:val="310E69FE"/>
@@ -3246,7 +3745,7 @@
       </w:rPr>
     </w:lvl>
   </w:abstractNum>
-  <w:abstractNum w:abstractNumId="5" w15:restartNumberingAfterBreak="0">
+  <w:abstractNum w:abstractNumId="6" w15:restartNumberingAfterBreak="0">
     <w:nsid w:val="0DCC0089"/>
     <w:multiLevelType w:val="multilevel"/>
     <w:tmpl w:val="7146E3E2"/>
@@ -3391,7 +3890,7 @@
       </w:rPr>
     </w:lvl>
   </w:abstractNum>
-  <w:abstractNum w:abstractNumId="6" w15:restartNumberingAfterBreak="0">
+  <w:abstractNum w:abstractNumId="7" w15:restartNumberingAfterBreak="0">
     <w:nsid w:val="18A476E1"/>
     <w:multiLevelType w:val="multilevel"/>
     <w:tmpl w:val="D8C0EA1A"/>
@@ -3540,7 +4039,7 @@
       </w:rPr>
     </w:lvl>
   </w:abstractNum>
-  <w:abstractNum w:abstractNumId="7" w15:restartNumberingAfterBreak="0">
+  <w:abstractNum w:abstractNumId="8" w15:restartNumberingAfterBreak="0">
     <w:nsid w:val="18DF5EED"/>
     <w:multiLevelType w:val="multilevel"/>
     <w:tmpl w:val="C8EA77B4"/>
@@ -3685,7 +4184,7 @@
       </w:rPr>
     </w:lvl>
   </w:abstractNum>
-  <w:abstractNum w:abstractNumId="8" w15:restartNumberingAfterBreak="0">
+  <w:abstractNum w:abstractNumId="9" w15:restartNumberingAfterBreak="0">
     <w:nsid w:val="22CE63A4"/>
     <w:multiLevelType w:val="multilevel"/>
     <w:tmpl w:val="ADBC84EC"/>
@@ -3834,7 +4333,7 @@
       </w:rPr>
     </w:lvl>
   </w:abstractNum>
-  <w:abstractNum w:abstractNumId="9" w15:restartNumberingAfterBreak="0">
+  <w:abstractNum w:abstractNumId="10" w15:restartNumberingAfterBreak="0">
     <w:nsid w:val="2DAE2C20"/>
     <w:multiLevelType w:val="multilevel"/>
     <w:tmpl w:val="ECA039D4"/>
@@ -3983,7 +4482,156 @@
       </w:rPr>
     </w:lvl>
   </w:abstractNum>
-  <w:abstractNum w:abstractNumId="10" w15:restartNumberingAfterBreak="0">
+  <w:abstractNum w:abstractNumId="11" w15:restartNumberingAfterBreak="0">
+    <w:nsid w:val="42B0135B"/>
+    <w:multiLevelType w:val="multilevel"/>
+    <w:tmpl w:val="972E686A"/>
+    <w:lvl w:ilvl="0">
+      <w:start w:val="1"/>
+      <w:numFmt w:val="bullet"/>
+      <w:lvlText w:val=""/>
+      <w:lvlJc w:val="left"/>
+      <w:pPr>
+        <w:tabs>
+          <w:tab w:val="num" w:pos="720"/>
+        </w:tabs>
+        <w:ind w:left="720" w:hanging="360"/>
+      </w:pPr>
+      <w:rPr>
+        <w:rFonts w:ascii="Symbol" w:hAnsi="Symbol" w:hint="default"/>
+        <w:sz w:val="20"/>
+      </w:rPr>
+    </w:lvl>
+    <w:lvl w:ilvl="1">
+      <w:start w:val="1"/>
+      <w:numFmt w:val="bullet"/>
+      <w:lvlText w:val="o"/>
+      <w:lvlJc w:val="left"/>
+      <w:pPr>
+        <w:tabs>
+          <w:tab w:val="num" w:pos="1440"/>
+        </w:tabs>
+        <w:ind w:left="1440" w:hanging="360"/>
+      </w:pPr>
+      <w:rPr>
+        <w:rFonts w:ascii="Courier New" w:hAnsi="Courier New" w:hint="default"/>
+        <w:sz w:val="20"/>
+      </w:rPr>
+    </w:lvl>
+    <w:lvl w:ilvl="2" w:tentative="1">
+      <w:start w:val="1"/>
+      <w:numFmt w:val="bullet"/>
+      <w:lvlText w:val=""/>
+      <w:lvlJc w:val="left"/>
+      <w:pPr>
+        <w:tabs>
+          <w:tab w:val="num" w:pos="2160"/>
+        </w:tabs>
+        <w:ind w:left="2160" w:hanging="360"/>
+      </w:pPr>
+      <w:rPr>
+        <w:rFonts w:ascii="Wingdings" w:hAnsi="Wingdings" w:hint="default"/>
+        <w:sz w:val="20"/>
+      </w:rPr>
+    </w:lvl>
+    <w:lvl w:ilvl="3" w:tentative="1">
+      <w:start w:val="1"/>
+      <w:numFmt w:val="bullet"/>
+      <w:lvlText w:val=""/>
+      <w:lvlJc w:val="left"/>
+      <w:pPr>
+        <w:tabs>
+          <w:tab w:val="num" w:pos="2880"/>
+        </w:tabs>
+        <w:ind w:left="2880" w:hanging="360"/>
+      </w:pPr>
+      <w:rPr>
+        <w:rFonts w:ascii="Wingdings" w:hAnsi="Wingdings" w:hint="default"/>
+        <w:sz w:val="20"/>
+      </w:rPr>
+    </w:lvl>
+    <w:lvl w:ilvl="4" w:tentative="1">
+      <w:start w:val="1"/>
+      <w:numFmt w:val="bullet"/>
+      <w:lvlText w:val=""/>
+      <w:lvlJc w:val="left"/>
+      <w:pPr>
+        <w:tabs>
+          <w:tab w:val="num" w:pos="3600"/>
+        </w:tabs>
+        <w:ind w:left="3600" w:hanging="360"/>
+      </w:pPr>
+      <w:rPr>
+        <w:rFonts w:ascii="Wingdings" w:hAnsi="Wingdings" w:hint="default"/>
+        <w:sz w:val="20"/>
+      </w:rPr>
+    </w:lvl>
+    <w:lvl w:ilvl="5" w:tentative="1">
+      <w:start w:val="1"/>
+      <w:numFmt w:val="bullet"/>
+      <w:lvlText w:val=""/>
+      <w:lvlJc w:val="left"/>
+      <w:pPr>
+        <w:tabs>
+          <w:tab w:val="num" w:pos="4320"/>
+        </w:tabs>
+        <w:ind w:left="4320" w:hanging="360"/>
+      </w:pPr>
+      <w:rPr>
+        <w:rFonts w:ascii="Wingdings" w:hAnsi="Wingdings" w:hint="default"/>
+        <w:sz w:val="20"/>
+      </w:rPr>
+    </w:lvl>
+    <w:lvl w:ilvl="6" w:tentative="1">
+      <w:start w:val="1"/>
+      <w:numFmt w:val="bullet"/>
+      <w:lvlText w:val=""/>
+      <w:lvlJc w:val="left"/>
+      <w:pPr>
+        <w:tabs>
+          <w:tab w:val="num" w:pos="5040"/>
+        </w:tabs>
+        <w:ind w:left="5040" w:hanging="360"/>
+      </w:pPr>
+      <w:rPr>
+        <w:rFonts w:ascii="Wingdings" w:hAnsi="Wingdings" w:hint="default"/>
+        <w:sz w:val="20"/>
+      </w:rPr>
+    </w:lvl>
+    <w:lvl w:ilvl="7" w:tentative="1">
+      <w:start w:val="1"/>
+      <w:numFmt w:val="bullet"/>
+      <w:lvlText w:val=""/>
+      <w:lvlJc w:val="left"/>
+      <w:pPr>
+        <w:tabs>
+          <w:tab w:val="num" w:pos="5760"/>
+        </w:tabs>
+        <w:ind w:left="5760" w:hanging="360"/>
+      </w:pPr>
+      <w:rPr>
+        <w:rFonts w:ascii="Wingdings" w:hAnsi="Wingdings" w:hint="default"/>
+        <w:sz w:val="20"/>
+      </w:rPr>
+    </w:lvl>
+    <w:lvl w:ilvl="8" w:tentative="1">
+      <w:start w:val="1"/>
+      <w:numFmt w:val="bullet"/>
+      <w:lvlText w:val=""/>
+      <w:lvlJc w:val="left"/>
+      <w:pPr>
+        <w:tabs>
+          <w:tab w:val="num" w:pos="6480"/>
+        </w:tabs>
+        <w:ind w:left="6480" w:hanging="360"/>
+      </w:pPr>
+      <w:rPr>
+        <w:rFonts w:ascii="Wingdings" w:hAnsi="Wingdings" w:hint="default"/>
+        <w:sz w:val="20"/>
+      </w:rPr>
+    </w:lvl>
+  </w:abstractNum>
+  <w:abstractNum w:abstractNumId="12" w15:restartNumberingAfterBreak="0">
     <w:nsid w:val="4AA737B7"/>
     <w:multiLevelType w:val="multilevel"/>
     <w:tmpl w:val="58D449CA"/>
@@ -4132,7 +4780,7 @@
       </w:rPr>
     </w:lvl>
   </w:abstractNum>
-  <w:abstractNum w:abstractNumId="11" w15:restartNumberingAfterBreak="0">
+  <w:abstractNum w:abstractNumId="13" w15:restartNumberingAfterBreak="0">
     <w:nsid w:val="4AEA2EE4"/>
     <w:multiLevelType w:val="multilevel"/>
     <w:tmpl w:val="175ED060"/>
@@ -4281,7 +4929,7 @@
       </w:rPr>
     </w:lvl>
   </w:abstractNum>
-  <w:abstractNum w:abstractNumId="12" w15:restartNumberingAfterBreak="0">
+  <w:abstractNum w:abstractNumId="14" w15:restartNumberingAfterBreak="0">
     <w:nsid w:val="57D41E13"/>
     <w:multiLevelType w:val="multilevel"/>
     <w:tmpl w:val="D71E2C1C"/>
@@ -4430,7 +5078,156 @@
       </w:rPr>
     </w:lvl>
   </w:abstractNum>
-  <w:abstractNum w:abstractNumId="13" w15:restartNumberingAfterBreak="0">
+  <w:abstractNum w:abstractNumId="15" w15:restartNumberingAfterBreak="0">
+    <w:nsid w:val="5AAB0D32"/>
+    <w:multiLevelType w:val="multilevel"/>
+    <w:tmpl w:val="D8F262EC"/>
+    <w:lvl w:ilvl="0">
+      <w:start w:val="1"/>
+      <w:numFmt w:val="bullet"/>
+      <w:lvlText w:val=""/>
+      <w:lvlJc w:val="left"/>
+      <w:pPr>
+        <w:tabs>
+          <w:tab w:val="num" w:pos="720"/>
+        </w:tabs>
+        <w:ind w:left="720" w:hanging="360"/>
+      </w:pPr>
+      <w:rPr>
+        <w:rFonts w:ascii="Symbol" w:hAnsi="Symbol" w:hint="default"/>
+        <w:sz w:val="20"/>
+      </w:rPr>
+    </w:lvl>
+    <w:lvl w:ilvl="1">
+      <w:start w:val="1"/>
+      <w:numFmt w:val="bullet"/>
+      <w:lvlText w:val="o"/>
+      <w:lvlJc w:val="left"/>
+      <w:pPr>
+        <w:tabs>
+          <w:tab w:val="num" w:pos="1440"/>
+        </w:tabs>
+        <w:ind w:left="1440" w:hanging="360"/>
+      </w:pPr>
+      <w:rPr>
+        <w:rFonts w:ascii="Courier New" w:hAnsi="Courier New" w:hint="default"/>
+        <w:sz w:val="20"/>
+      </w:rPr>
+    </w:lvl>
+    <w:lvl w:ilvl="2" w:tentative="1">
+      <w:start w:val="1"/>
+      <w:numFmt w:val="bullet"/>
+      <w:lvlText w:val=""/>
+      <w:lvlJc w:val="left"/>
+      <w:pPr>
+        <w:tabs>
+          <w:tab w:val="num" w:pos="2160"/>
+        </w:tabs>
+        <w:ind w:left="2160" w:hanging="360"/>
+      </w:pPr>
+      <w:rPr>
+        <w:rFonts w:ascii="Wingdings" w:hAnsi="Wingdings" w:hint="default"/>
+        <w:sz w:val="20"/>
+      </w:rPr>
+    </w:lvl>
+    <w:lvl w:ilvl="3" w:tentative="1">
+      <w:start w:val="1"/>
+      <w:numFmt w:val="bullet"/>
+      <w:lvlText w:val=""/>
+      <w:lvlJc w:val="left"/>
+      <w:pPr>
+        <w:tabs>
+          <w:tab w:val="num" w:pos="2880"/>
+        </w:tabs>
+        <w:ind w:left="2880" w:hanging="360"/>
+      </w:pPr>
+      <w:rPr>
+        <w:rFonts w:ascii="Wingdings" w:hAnsi="Wingdings" w:hint="default"/>
+        <w:sz w:val="20"/>
+      </w:rPr>
+    </w:lvl>
+    <w:lvl w:ilvl="4" w:tentative="1">
+      <w:start w:val="1"/>
+      <w:numFmt w:val="bullet"/>
+      <w:lvlText w:val=""/>
+      <w:lvlJc w:val="left"/>
+      <w:pPr>
+        <w:tabs>
+          <w:tab w:val="num" w:pos="3600"/>
+        </w:tabs>
+        <w:ind w:left="3600" w:hanging="360"/>
+      </w:pPr>
+      <w:rPr>
+        <w:rFonts w:ascii="Wingdings" w:hAnsi="Wingdings" w:hint="default"/>
+        <w:sz w:val="20"/>
+      </w:rPr>
+    </w:lvl>
+    <w:lvl w:ilvl="5" w:tentative="1">
+      <w:start w:val="1"/>
+      <w:numFmt w:val="bullet"/>
+      <w:lvlText w:val=""/>
+      <w:lvlJc w:val="left"/>
+      <w:pPr>
+        <w:tabs>
+          <w:tab w:val="num" w:pos="4320"/>
+        </w:tabs>
+        <w:ind w:left="4320" w:hanging="360"/>
+      </w:pPr>
+      <w:rPr>
+        <w:rFonts w:ascii="Wingdings" w:hAnsi="Wingdings" w:hint="default"/>
+        <w:sz w:val="20"/>
+      </w:rPr>
+    </w:lvl>
+    <w:lvl w:ilvl="6" w:tentative="1">
+      <w:start w:val="1"/>
+      <w:numFmt w:val="bullet"/>
+      <w:lvlText w:val=""/>
+      <w:lvlJc w:val="left"/>
+      <w:pPr>
+        <w:tabs>
+          <w:tab w:val="num" w:pos="5040"/>
+        </w:tabs>
+        <w:ind w:left="5040" w:hanging="360"/>
+      </w:pPr>
+      <w:rPr>
+        <w:rFonts w:ascii="Wingdings" w:hAnsi="Wingdings" w:hint="default"/>
+        <w:sz w:val="20"/>
+      </w:rPr>
+    </w:lvl>
+    <w:lvl w:ilvl="7" w:tentative="1">
+      <w:start w:val="1"/>
+      <w:numFmt w:val="bullet"/>
+      <w:lvlText w:val=""/>
+      <w:lvlJc w:val="left"/>
+      <w:pPr>
+        <w:tabs>
+          <w:tab w:val="num" w:pos="5760"/>
+        </w:tabs>
+        <w:ind w:left="5760" w:hanging="360"/>
+      </w:pPr>
+      <w:rPr>
+        <w:rFonts w:ascii="Wingdings" w:hAnsi="Wingdings" w:hint="default"/>
+        <w:sz w:val="20"/>
+      </w:rPr>
+    </w:lvl>
+    <w:lvl w:ilvl="8" w:tentative="1">
+      <w:start w:val="1"/>
+      <w:numFmt w:val="bullet"/>
+      <w:lvlText w:val=""/>
+      <w:lvlJc w:val="left"/>
+      <w:pPr>
+        <w:tabs>
+          <w:tab w:val="num" w:pos="6480"/>
+        </w:tabs>
+        <w:ind w:left="6480" w:hanging="360"/>
+      </w:pPr>
+      <w:rPr>
+        <w:rFonts w:ascii="Wingdings" w:hAnsi="Wingdings" w:hint="default"/>
+        <w:sz w:val="20"/>
+      </w:rPr>
+    </w:lvl>
+  </w:abstractNum>
+  <w:abstractNum w:abstractNumId="16" w15:restartNumberingAfterBreak="0">
     <w:nsid w:val="5CFF7FE6"/>
     <w:multiLevelType w:val="multilevel"/>
     <w:tmpl w:val="D05849DA"/>
@@ -4579,7 +5376,7 @@
       </w:rPr>
     </w:lvl>
   </w:abstractNum>
-  <w:abstractNum w:abstractNumId="14" w15:restartNumberingAfterBreak="0">
+  <w:abstractNum w:abstractNumId="17" w15:restartNumberingAfterBreak="0">
     <w:nsid w:val="617E6A70"/>
     <w:multiLevelType w:val="multilevel"/>
     <w:tmpl w:val="406A7CB4"/>
@@ -4728,7 +5525,7 @@
       </w:rPr>
     </w:lvl>
   </w:abstractNum>
-  <w:abstractNum w:abstractNumId="15" w15:restartNumberingAfterBreak="0">
+  <w:abstractNum w:abstractNumId="18" w15:restartNumberingAfterBreak="0">
     <w:nsid w:val="654B291D"/>
     <w:multiLevelType w:val="multilevel"/>
     <w:tmpl w:val="CE82F82C"/>
@@ -4877,53 +5674,214 @@
       </w:rPr>
     </w:lvl>
   </w:abstractNum>
+  <w:abstractNum w:abstractNumId="19" w15:restartNumberingAfterBreak="0">
+    <w:nsid w:val="7BAA0735"/>
+    <w:multiLevelType w:val="multilevel"/>
+    <w:tmpl w:val="3490D720"/>
+    <w:lvl w:ilvl="0">
+      <w:start w:val="1"/>
+      <w:numFmt w:val="bullet"/>
+      <w:lvlText w:val=""/>
+      <w:lvlJc w:val="left"/>
+      <w:pPr>
+        <w:tabs>
+          <w:tab w:val="num" w:pos="720"/>
+        </w:tabs>
+        <w:ind w:left="720" w:hanging="360"/>
+      </w:pPr>
+      <w:rPr>
+        <w:rFonts w:ascii="Symbol" w:hAnsi="Symbol" w:hint="default"/>
+        <w:sz w:val="20"/>
+      </w:rPr>
+    </w:lvl>
+    <w:lvl w:ilvl="1">
+      <w:start w:val="1"/>
+      <w:numFmt w:val="bullet"/>
+      <w:lvlText w:val="o"/>
+      <w:lvlJc w:val="left"/>
+      <w:pPr>
+        <w:tabs>
+          <w:tab w:val="num" w:pos="1440"/>
+        </w:tabs>
+        <w:ind w:left="1440" w:hanging="360"/>
+      </w:pPr>
+      <w:rPr>
+        <w:rFonts w:ascii="Courier New" w:hAnsi="Courier New" w:hint="default"/>
+        <w:sz w:val="20"/>
+      </w:rPr>
+    </w:lvl>
+    <w:lvl w:ilvl="2" w:tentative="1">
+      <w:start w:val="1"/>
+      <w:numFmt w:val="bullet"/>
+      <w:lvlText w:val=""/>
+      <w:lvlJc w:val="left"/>
+      <w:pPr>
+        <w:tabs>
+          <w:tab w:val="num" w:pos="2160"/>
+        </w:tabs>
+        <w:ind w:left="2160" w:hanging="360"/>
+      </w:pPr>
+      <w:rPr>
+        <w:rFonts w:ascii="Wingdings" w:hAnsi="Wingdings" w:hint="default"/>
+        <w:sz w:val="20"/>
+      </w:rPr>
+    </w:lvl>
+    <w:lvl w:ilvl="3" w:tentative="1">
+      <w:start w:val="1"/>
+      <w:numFmt w:val="bullet"/>
+      <w:lvlText w:val=""/>
+      <w:lvlJc w:val="left"/>
+      <w:pPr>
+        <w:tabs>
+          <w:tab w:val="num" w:pos="2880"/>
+        </w:tabs>
+        <w:ind w:left="2880" w:hanging="360"/>
+      </w:pPr>
+      <w:rPr>
+        <w:rFonts w:ascii="Wingdings" w:hAnsi="Wingdings" w:hint="default"/>
+        <w:sz w:val="20"/>
+      </w:rPr>
+    </w:lvl>
+    <w:lvl w:ilvl="4" w:tentative="1">
+      <w:start w:val="1"/>
+      <w:numFmt w:val="bullet"/>
+      <w:lvlText w:val=""/>
+      <w:lvlJc w:val="left"/>
+      <w:pPr>
+        <w:tabs>
+          <w:tab w:val="num" w:pos="3600"/>
+        </w:tabs>
+        <w:ind w:left="3600" w:hanging="360"/>
+      </w:pPr>
+      <w:rPr>
+        <w:rFonts w:ascii="Wingdings" w:hAnsi="Wingdings" w:hint="default"/>
+        <w:sz w:val="20"/>
+      </w:rPr>
+    </w:lvl>
+    <w:lvl w:ilvl="5" w:tentative="1">
+      <w:start w:val="1"/>
+      <w:numFmt w:val="bullet"/>
+      <w:lvlText w:val=""/>
+      <w:lvlJc w:val="left"/>
+      <w:pPr>
+        <w:tabs>
+          <w:tab w:val="num" w:pos="4320"/>
+        </w:tabs>
+        <w:ind w:left="4320" w:hanging="360"/>
+      </w:pPr>
+      <w:rPr>
+        <w:rFonts w:ascii="Wingdings" w:hAnsi="Wingdings" w:hint="default"/>
+        <w:sz w:val="20"/>
+      </w:rPr>
+    </w:lvl>
+    <w:lvl w:ilvl="6" w:tentative="1">
+      <w:start w:val="1"/>
+      <w:numFmt w:val="bullet"/>
+      <w:lvlText w:val=""/>
+      <w:lvlJc w:val="left"/>
+      <w:pPr>
+        <w:tabs>
+          <w:tab w:val="num" w:pos="5040"/>
+        </w:tabs>
+        <w:ind w:left="5040" w:hanging="360"/>
+      </w:pPr>
+      <w:rPr>
+        <w:rFonts w:ascii="Wingdings" w:hAnsi="Wingdings" w:hint="default"/>
+        <w:sz w:val="20"/>
+      </w:rPr>
+    </w:lvl>
+    <w:lvl w:ilvl="7" w:tentative="1">
+      <w:start w:val="1"/>
+      <w:numFmt w:val="bullet"/>
+      <w:lvlText w:val=""/>
+      <w:lvlJc w:val="left"/>
+      <w:pPr>
+        <w:tabs>
+          <w:tab w:val="num" w:pos="5760"/>
+        </w:tabs>
+        <w:ind w:left="5760" w:hanging="360"/>
+      </w:pPr>
+      <w:rPr>
+        <w:rFonts w:ascii="Wingdings" w:hAnsi="Wingdings" w:hint="default"/>
+        <w:sz w:val="20"/>
+      </w:rPr>
+    </w:lvl>
+    <w:lvl w:ilvl="8" w:tentative="1">
+      <w:start w:val="1"/>
+      <w:numFmt w:val="bullet"/>
+      <w:lvlText w:val=""/>
+      <w:lvlJc w:val="left"/>
+      <w:pPr>
+        <w:tabs>
+          <w:tab w:val="num" w:pos="6480"/>
+        </w:tabs>
+        <w:ind w:left="6480" w:hanging="360"/>
+      </w:pPr>
+      <w:rPr>
+        <w:rFonts w:ascii="Wingdings" w:hAnsi="Wingdings" w:hint="default"/>
+        <w:sz w:val="20"/>
+      </w:rPr>
+    </w:lvl>
+  </w:abstractNum>
   <w:num w:numId="1" w16cid:durableId="1224483013">
+    <w:abstractNumId w:val="5"/>
+  </w:num>
+  <w:num w:numId="2" w16cid:durableId="1026322408">
+    <w:abstractNumId w:val="13"/>
+  </w:num>
+  <w:num w:numId="3" w16cid:durableId="1391269217">
+    <w:abstractNumId w:val="14"/>
+  </w:num>
+  <w:num w:numId="4" w16cid:durableId="1642610741">
+    <w:abstractNumId w:val="16"/>
+  </w:num>
+  <w:num w:numId="5" w16cid:durableId="128207342">
+    <w:abstractNumId w:val="1"/>
+  </w:num>
+  <w:num w:numId="6" w16cid:durableId="643001729">
+    <w:abstractNumId w:val="18"/>
+  </w:num>
+  <w:num w:numId="7" w16cid:durableId="1743596104">
+    <w:abstractNumId w:val="10"/>
+  </w:num>
+  <w:num w:numId="8" w16cid:durableId="513305587">
+    <w:abstractNumId w:val="12"/>
+  </w:num>
+  <w:num w:numId="9" w16cid:durableId="1574512212">
+    <w:abstractNumId w:val="3"/>
+  </w:num>
+  <w:num w:numId="10" w16cid:durableId="973295243">
     <w:abstractNumId w:val="4"/>
   </w:num>
-  <w:num w:numId="2" w16cid:durableId="1026322408">
+  <w:num w:numId="11" w16cid:durableId="1657568341">
+    <w:abstractNumId w:val="8"/>
+  </w:num>
+  <w:num w:numId="12" w16cid:durableId="1726946852">
+    <w:abstractNumId w:val="9"/>
+  </w:num>
+  <w:num w:numId="13" w16cid:durableId="2138599504">
+    <w:abstractNumId w:val="6"/>
+  </w:num>
+  <w:num w:numId="14" w16cid:durableId="1428312588">
+    <w:abstractNumId w:val="2"/>
+  </w:num>
+  <w:num w:numId="15" w16cid:durableId="1289311394">
+    <w:abstractNumId w:val="17"/>
+  </w:num>
+  <w:num w:numId="16" w16cid:durableId="888299261">
+    <w:abstractNumId w:val="7"/>
+  </w:num>
+  <w:num w:numId="17" w16cid:durableId="126288842">
+    <w:abstractNumId w:val="0"/>
+  </w:num>
+  <w:num w:numId="18" w16cid:durableId="877161110">
+    <w:abstractNumId w:val="19"/>
+  </w:num>
+  <w:num w:numId="19" w16cid:durableId="624700080">
     <w:abstractNumId w:val="11"/>
   </w:num>
-  <w:num w:numId="3" w16cid:durableId="1391269217">
-    <w:abstractNumId w:val="12"/>
-  </w:num>
-  <w:num w:numId="4" w16cid:durableId="1642610741">
-    <w:abstractNumId w:val="13"/>
-  </w:num>
-  <w:num w:numId="5" w16cid:durableId="128207342">
-    <w:abstractNumId w:val="0"/>
-  </w:num>
-  <w:num w:numId="6" w16cid:durableId="643001729">
+  <w:num w:numId="20" w16cid:durableId="1225869788">
     <w:abstractNumId w:val="15"/>
-  </w:num>
-  <w:num w:numId="7" w16cid:durableId="1743596104">
-    <w:abstractNumId w:val="9"/>
-  </w:num>
-  <w:num w:numId="8" w16cid:durableId="513305587">
-    <w:abstractNumId w:val="10"/>
-  </w:num>
-  <w:num w:numId="9" w16cid:durableId="1574512212">
-    <w:abstractNumId w:val="2"/>
-  </w:num>
-  <w:num w:numId="10" w16cid:durableId="973295243">
-    <w:abstractNumId w:val="3"/>
-  </w:num>
-  <w:num w:numId="11" w16cid:durableId="1657568341">
-    <w:abstractNumId w:val="7"/>
-  </w:num>
-  <w:num w:numId="12" w16cid:durableId="1726946852">
-    <w:abstractNumId w:val="8"/>
-  </w:num>
-  <w:num w:numId="13" w16cid:durableId="2138599504">
-    <w:abstractNumId w:val="5"/>
-  </w:num>
-  <w:num w:numId="14" w16cid:durableId="1428312588">
-    <w:abstractNumId w:val="1"/>
-  </w:num>
-  <w:num w:numId="15" w16cid:durableId="1289311394">
-    <w:abstractNumId w:val="14"/>
-  </w:num>
-  <w:num w:numId="16" w16cid:durableId="888299261">
-    <w:abstractNumId w:val="6"/>
   </w:num>
 </w:numbering>
 </file>

</xml_diff>